<commit_message>
Overhaul DDMR to 5 digital transformation dimensions + add Messer demo
- Replace old dimensions (SL/FIN/IC) with ST/OSC/SM/TA/SC scored from
  digital transformation public signals with maturity labels
  (Legacy/Siloed/Strategic/Future Ready)
- Janatics composite updated to 64/100 (Siloed); Messer at 72/100 (Strategic)
- Add Next Best Actions section to web report, Word doc, and PowerPoint deck
  with initiative, expected benefit, cost of inaction, and why-now per company
- Login page updated to show two live demo cards (Janatics + Messer)
- Report page routes demo= param to correct dataset
- Regenerate xlsx, docx, pptx output files with new dimensions

Co-Authored-By: Claude Sonnet 4.6 <noreply@anthropic.com>
</commit_message>
<xml_diff>
--- a/output/Janatics_DDMR_Report.docx
+++ b/output/Janatics_DDMR_Report.docx
@@ -50,10 +50,10 @@
       <w:r>
         <w:rPr>
           <w:b/>
-          <w:color w:val="00B050"/>
+          <w:color w:val="FFC000"/>
           <w:sz w:val="28"/>
         </w:rPr>
-        <w:t>Composite DDMR Score: 75.7/100  —  Strong</w:t>
+        <w:t>Composite DDMR Score: 64/100  —  Siloed</w:t>
       </w:r>
     </w:p>
     <w:p>
@@ -75,26 +75,23 @@
     </w:p>
     <w:p>
       <w:r>
-        <w:t>Janatics India Private Limited (CIN: U31103TZ1991PTC003409) is a Coimbatore-based manufacturer of pneumatic components and industrial automation products, incorporated in 1991 and operating since 1977. With FY2025 revenue of ₹531 Crore and over 3,500 distinct products sold across 42+ countries to 17,000+ customers, the company represents one of India's most established domestic pneumatics brands. It holds ICRA credit ratings with a Stable outlook and has subsidiaries in the USA and Germany.</w:t>
+        <w:t>Janatics India Private Limited (CIN: U31103TZ1991PTC003409) is assessed for digital transformation maturity using five dimensions derived exclusively from public signals: Strategy, Operations &amp; Supply Chain, Sales &amp; Marketing, Technology Adoption, and Skills &amp; Capabilities. The company is a Coimbatore-based manufacturer of pneumatic and industrial automation products, incorporated in 1991 and operating since 1977, with ₹531 Crore FY2025 revenue, ICRA Stable credit, and export presence in 42+ countries.</w:t>
       </w:r>
     </w:p>
     <w:p/>
     <w:p>
       <w:r>
-        <w:rPr>
-          <w:b w:val="0"/>
-        </w:rPr>
-        <w:t xml:space="preserve">The DDMR composite score is </w:t>
+        <w:t xml:space="preserve">DDMR Composite Score: </w:t>
       </w:r>
       <w:r>
         <w:rPr>
           <w:b/>
-          <w:color w:val="00B050"/>
+          <w:color w:val="FFC000"/>
         </w:rPr>
-        <w:t>75.7/100 (Strong)</w:t>
+        <w:t>64/100 — Siloed</w:t>
       </w:r>
       <w:r>
-        <w:t>, reflecting strong operational foundations, global presence, and brand maturity, partially offset by below-industry revenue growth (4% vs 6.9% sector CAGR) and EBITDA margin compression observed in FY2025.</w:t>
+        <w:t>. Digital intent is visible in Janatics' product strategy — the pivot to electric actuators, robotics, smart sensors, and Industry 4.0 equipment signals leadership awareness of digital megatrends. However, systematic digitization of internal operations, sales channels, and workforce development remains nascent based on public evidence, placing the company in the Siloed maturity band.</w:t>
       </w:r>
     </w:p>
     <w:p/>
@@ -167,7 +164,7 @@
                 <w:b/>
                 <w:color w:val="FFFFFF"/>
               </w:rPr>
-              <w:t>Rating</w:t>
+              <w:t>Maturity Level</w:t>
             </w:r>
           </w:p>
         </w:tc>
@@ -183,7 +180,7 @@
               <w:rPr>
                 <w:color w:val="1F3864"/>
               </w:rPr>
-              <w:t>Strategy &amp; Leadership</w:t>
+              <w:t>Strategy</w:t>
             </w:r>
           </w:p>
         </w:tc>
@@ -197,7 +194,7 @@
               <w:rPr>
                 <w:color w:val="1F3864"/>
               </w:rPr>
-              <w:t>81</w:t>
+              <w:t>70</w:t>
             </w:r>
           </w:p>
         </w:tc>
@@ -211,7 +208,7 @@
               <w:rPr>
                 <w:color w:val="1F3864"/>
               </w:rPr>
-              <w:t>25%</w:t>
+              <w:t>20%</w:t>
             </w:r>
           </w:p>
         </w:tc>
@@ -225,7 +222,65 @@
               <w:rPr>
                 <w:color w:val="1F3864"/>
               </w:rPr>
-              <w:t>Strong</w:t>
+              <w:t>Strategic</w:t>
+            </w:r>
+          </w:p>
+        </w:tc>
+      </w:tr>
+      <w:tr>
+        <w:tc>
+          <w:tcPr>
+            <w:tcW w:type="dxa" w:w="2351"/>
+            <w:shd w:val="clear" w:color="auto" w:fill="D6E4F0"/>
+          </w:tcPr>
+          <w:p>
+            <w:r>
+              <w:rPr>
+                <w:color w:val="1F3864"/>
+              </w:rPr>
+              <w:t>Operations &amp; Supply Chain</w:t>
+            </w:r>
+          </w:p>
+        </w:tc>
+        <w:tc>
+          <w:tcPr>
+            <w:tcW w:type="dxa" w:w="2351"/>
+            <w:shd w:val="clear" w:color="auto" w:fill="D6E4F0"/>
+          </w:tcPr>
+          <w:p>
+            <w:r>
+              <w:rPr>
+                <w:color w:val="1F3864"/>
+              </w:rPr>
+              <w:t>65</w:t>
+            </w:r>
+          </w:p>
+        </w:tc>
+        <w:tc>
+          <w:tcPr>
+            <w:tcW w:type="dxa" w:w="2351"/>
+            <w:shd w:val="clear" w:color="auto" w:fill="D6E4F0"/>
+          </w:tcPr>
+          <w:p>
+            <w:r>
+              <w:rPr>
+                <w:color w:val="1F3864"/>
+              </w:rPr>
+              <w:t>20%</w:t>
+            </w:r>
+          </w:p>
+        </w:tc>
+        <w:tc>
+          <w:tcPr>
+            <w:tcW w:type="dxa" w:w="2351"/>
+            <w:shd w:val="clear" w:color="auto" w:fill="D6E4F0"/>
+          </w:tcPr>
+          <w:p>
+            <w:r>
+              <w:rPr>
+                <w:color w:val="1F3864"/>
+              </w:rPr>
+              <w:t>Siloed</w:t>
             </w:r>
           </w:p>
         </w:tc>
@@ -255,7 +310,7 @@
               <w:rPr>
                 <w:color w:val="1F3864"/>
               </w:rPr>
-              <w:t>78</w:t>
+              <w:t>55</w:t>
             </w:r>
           </w:p>
         </w:tc>
@@ -283,7 +338,7 @@
               <w:rPr>
                 <w:color w:val="1F3864"/>
               </w:rPr>
-              <w:t>Strong</w:t>
+              <w:t>Siloed</w:t>
             </w:r>
           </w:p>
         </w:tc>
@@ -299,7 +354,7 @@
               <w:rPr>
                 <w:color w:val="1F3864"/>
               </w:rPr>
-              <w:t>Operations &amp; Supply Chain</w:t>
+              <w:t>Technology Adoption</w:t>
             </w:r>
           </w:p>
         </w:tc>
@@ -313,7 +368,7 @@
               <w:rPr>
                 <w:color w:val="1F3864"/>
               </w:rPr>
-              <w:t>78</w:t>
+              <w:t>70</w:t>
             </w:r>
           </w:p>
         </w:tc>
@@ -341,7 +396,7 @@
               <w:rPr>
                 <w:color w:val="1F3864"/>
               </w:rPr>
-              <w:t>Strong</w:t>
+              <w:t>Strategic</w:t>
             </w:r>
           </w:p>
         </w:tc>
@@ -357,7 +412,7 @@
               <w:rPr>
                 <w:color w:val="1F3864"/>
               </w:rPr>
-              <w:t>Finance</w:t>
+              <w:t>Skills &amp; Capabilities</w:t>
             </w:r>
           </w:p>
         </w:tc>
@@ -371,7 +426,7 @@
               <w:rPr>
                 <w:color w:val="1F3864"/>
               </w:rPr>
-              <w:t>67</w:t>
+              <w:t>60</w:t>
             </w:r>
           </w:p>
         </w:tc>
@@ -385,7 +440,7 @@
               <w:rPr>
                 <w:color w:val="1F3864"/>
               </w:rPr>
-              <w:t>25%</w:t>
+              <w:t>20%</w:t>
             </w:r>
           </w:p>
         </w:tc>
@@ -399,65 +454,7 @@
               <w:rPr>
                 <w:color w:val="1F3864"/>
               </w:rPr>
-              <w:t>Moderate</w:t>
-            </w:r>
-          </w:p>
-        </w:tc>
-      </w:tr>
-      <w:tr>
-        <w:tc>
-          <w:tcPr>
-            <w:tcW w:type="dxa" w:w="2351"/>
-            <w:shd w:val="clear" w:color="auto" w:fill="D6E4F0"/>
-          </w:tcPr>
-          <w:p>
-            <w:r>
-              <w:rPr>
-                <w:color w:val="1F3864"/>
-              </w:rPr>
-              <w:t>Industry Context</w:t>
-            </w:r>
-          </w:p>
-        </w:tc>
-        <w:tc>
-          <w:tcPr>
-            <w:tcW w:type="dxa" w:w="2351"/>
-            <w:shd w:val="clear" w:color="auto" w:fill="D6E4F0"/>
-          </w:tcPr>
-          <w:p>
-            <w:r>
-              <w:rPr>
-                <w:color w:val="1F3864"/>
-              </w:rPr>
-              <w:t>75</w:t>
-            </w:r>
-          </w:p>
-        </w:tc>
-        <w:tc>
-          <w:tcPr>
-            <w:tcW w:type="dxa" w:w="2351"/>
-            <w:shd w:val="clear" w:color="auto" w:fill="D6E4F0"/>
-          </w:tcPr>
-          <w:p>
-            <w:r>
-              <w:rPr>
-                <w:color w:val="1F3864"/>
-              </w:rPr>
-              <w:t>10%</w:t>
-            </w:r>
-          </w:p>
-        </w:tc>
-        <w:tc>
-          <w:tcPr>
-            <w:tcW w:type="dxa" w:w="2351"/>
-            <w:shd w:val="clear" w:color="auto" w:fill="D6E4F0"/>
-          </w:tcPr>
-          <w:p>
-            <w:r>
-              <w:rPr>
-                <w:color w:val="1F3864"/>
-              </w:rPr>
-              <w:t>Strong</w:t>
+              <w:t>Siloed</w:t>
             </w:r>
           </w:p>
         </w:tc>
@@ -489,7 +486,7 @@
                 <w:b/>
                 <w:color w:val="FFFFFF"/>
               </w:rPr>
-              <w:t>75.7</w:t>
+              <w:t>64</w:t>
             </w:r>
           </w:p>
         </w:tc>
@@ -519,12 +516,34 @@
                 <w:b/>
                 <w:color w:val="FFFFFF"/>
               </w:rPr>
-              <w:t>Strong</w:t>
+              <w:t>Siloed</w:t>
             </w:r>
           </w:p>
         </w:tc>
       </w:tr>
     </w:tbl>
+    <w:p>
+      <w:r>
+        <w:br w:type="page"/>
+      </w:r>
+    </w:p>
+    <w:p>
+      <w:pPr>
+        <w:pStyle w:val="Heading2"/>
+        <w:jc w:val="left"/>
+      </w:pPr>
+      <w:r>
+        <w:rPr>
+          <w:color w:val="1F3864"/>
+        </w:rPr>
+        <w:t>Maturity Scale Reference</w:t>
+      </w:r>
+    </w:p>
+    <w:p>
+      <w:r>
+        <w:t>Scores are mapped to four digital maturity levels: Legacy (0–33) — minimal digital presence; Siloed (34–66) — digital tools adopted in isolation, limited integration; Strategic (67–83) — deliberate digital strategy with cross-functional integration; Future Ready (84–100) — continuous digital innovation, data-driven, platform-enabled.</w:t>
+      </w:r>
+    </w:p>
     <w:p>
       <w:r>
         <w:br w:type="page"/>
@@ -539,22 +558,22 @@
         <w:rPr>
           <w:color w:val="1F3864"/>
         </w:rPr>
-        <w:t>2. Strategy &amp; Leadership (Score: 81/100 — Strong)</w:t>
+        <w:t>2. Strategy (Score: 70/100 — Strategic)</w:t>
       </w:r>
     </w:p>
     <w:p>
       <w:r>
-        <w:t>Janatics India demonstrates exceptional leadership tenure and strategic clarity. The company was established in 1977, giving it a 49-year operational track record — a rare distinction among domestic manufacturers. Its three-director board (Jaganathan Ganesh Kumar, G C Nageswaran, and Rajamani Ramesh) maintains active compliance with all DIN requirements and statutory filings with ROC Coimbatore.</w:t>
+        <w:t>Janatics India's digital strategy signals are visible primarily through product portfolio decisions rather than formal digital transformation declarations. The company's pivot toward electric actuators, smart sensors, robotic systems, and Industry 4.0-compatible didactic equipment demonstrates that leadership has recognised the digital megatrend in industrial automation. The DSIR-recognized R&amp;D division provides structural support for technology investment continuity.</w:t>
       </w:r>
     </w:p>
     <w:p>
       <w:r>
-        <w:t>The strategic expansion beyond pneumatics into electric actuators, sensors, motors, and robotic systems demonstrates forward-looking leadership aligned with Industry 4.0 megatrends. The establishment of subsidiaries in the USA and Germany reflects deliberate global market strategy rather than opportunistic export. The company's DSIR-recognized R&amp;D division signals commitment to proprietary innovation.</w:t>
+        <w:t>However, no formal digital transformation roadmap, chief digital officer appointment, or publicly articulated DX strategy has been evidenced from available public sources. Technology partnerships beyond DSIR recognition have not been disclosed, and the innovation pipeline — while active — follows an incremental product-extension model rather than platform or ecosystem-based digital strategy.</w:t>
       </w:r>
     </w:p>
     <w:p>
       <w:r>
-        <w:t>The primary governance gap is the absence of independent director disclosures or ESG commitments in public records — a factor increasingly scrutinized by institutional buyers and export partners.</w:t>
+        <w:t>The Strategy dimension score of 70/100 (Siloed) reflects awareness and intent without the systematic framework typical of a Strategic-band organization. The positive trajectory signal is the product-level digitization commitment, which, if extended to internal processes and go-to-market channels, could move the organization into the Strategic band.</w:t>
       </w:r>
     </w:p>
     <w:p/>
@@ -566,8 +585,8 @@
       </w:tblPr>
       <w:tblGrid>
         <w:gridCol w:w="2835"/>
-        <w:gridCol w:w="1134"/>
-        <w:gridCol w:w="5669"/>
+        <w:gridCol w:w="1701"/>
+        <w:gridCol w:w="5102"/>
       </w:tblGrid>
       <w:tr>
         <w:tc>
@@ -611,7 +630,42 @@
                 <w:b/>
                 <w:color w:val="FFFFFF"/>
               </w:rPr>
-              <w:t>Evidence</w:t>
+              <w:t>Public Signal / Evidence</w:t>
+            </w:r>
+          </w:p>
+        </w:tc>
+      </w:tr>
+      <w:tr>
+        <w:tc>
+          <w:tcPr>
+            <w:tcW w:type="dxa" w:w="3135"/>
+            <w:shd w:val="clear" w:color="auto" w:fill="FFF2CC"/>
+          </w:tcPr>
+          <w:p>
+            <w:r>
+              <w:t>ST01: Digital Strategy Articulation</w:t>
+            </w:r>
+          </w:p>
+        </w:tc>
+        <w:tc>
+          <w:tcPr>
+            <w:tcW w:type="dxa" w:w="3135"/>
+            <w:shd w:val="clear" w:color="auto" w:fill="FFF2CC"/>
+          </w:tcPr>
+          <w:p>
+            <w:r>
+              <w:t>65/100 (Siloed)</w:t>
+            </w:r>
+          </w:p>
+        </w:tc>
+        <w:tc>
+          <w:tcPr>
+            <w:tcW w:type="dxa" w:w="3135"/>
+            <w:shd w:val="clear" w:color="auto" w:fill="FFF2CC"/>
+          </w:tcPr>
+          <w:p>
+            <w:r>
+              <w:t>No formal DX roadmap; digital products mentioned but systemic strategy not publicly disclosed</w:t>
             </w:r>
           </w:p>
         </w:tc>
@@ -624,7 +678,7 @@
           </w:tcPr>
           <w:p>
             <w:r>
-              <w:t>SL01: Company/Founder Tenure</w:t>
+              <w:t>ST02: Leadership Technology Vision</w:t>
             </w:r>
           </w:p>
         </w:tc>
@@ -635,7 +689,7 @@
           </w:tcPr>
           <w:p>
             <w:r>
-              <w:t>90/100</w:t>
+              <w:t>72/100 (Strategic)</w:t>
             </w:r>
           </w:p>
         </w:tc>
@@ -646,7 +700,7 @@
           </w:tcPr>
           <w:p>
             <w:r>
-              <w:t>Established 1977; incorporated 1991 — 49-year operating history</w:t>
+              <w:t>Product pivot to I4.0 equipment signals digital awareness at leadership level</w:t>
             </w:r>
           </w:p>
         </w:tc>
@@ -659,7 +713,7 @@
           </w:tcPr>
           <w:p>
             <w:r>
-              <w:t>SL02: Director Profile &amp; DIN Compliance</w:t>
+              <w:t>ST03: Digital Investment Signals</w:t>
             </w:r>
           </w:p>
         </w:tc>
@@ -670,7 +724,7 @@
           </w:tcPr>
           <w:p>
             <w:r>
-              <w:t>75/100</w:t>
+              <w:t>75/100 (Strategic)</w:t>
             </w:r>
           </w:p>
         </w:tc>
@@ -681,7 +735,7 @@
           </w:tcPr>
           <w:p>
             <w:r>
-              <w:t>3 active directors; all DINs current; AGM Sept 2024</w:t>
+              <w:t>New IoT-enabled product lines indicate active technology capex commitment</w:t>
             </w:r>
           </w:p>
         </w:tc>
@@ -694,7 +748,7 @@
           </w:tcPr>
           <w:p>
             <w:r>
-              <w:t>SL03: Governance &amp; Filing Compliance</w:t>
+              <w:t>ST04: Technology Partnerships</w:t>
             </w:r>
           </w:p>
         </w:tc>
@@ -705,7 +759,7 @@
           </w:tcPr>
           <w:p>
             <w:r>
-              <w:t>80/100</w:t>
+              <w:t>68/100 (Strategic)</w:t>
             </w:r>
           </w:p>
         </w:tc>
@@ -716,7 +770,7 @@
           </w:tcPr>
           <w:p>
             <w:r>
-              <w:t>Annual filings current; no ROC penalties noted in public records</w:t>
+              <w:t>DSIR R&amp;D confirmed; no public digital alliance or ecosystem partner disclosures</w:t>
             </w:r>
           </w:p>
         </w:tc>
@@ -729,7 +783,7 @@
           </w:tcPr>
           <w:p>
             <w:r>
-              <w:t>SL04: Debt &amp; Charge Structure</w:t>
+              <w:t>ST05: Innovation Pipeline</w:t>
             </w:r>
           </w:p>
         </w:tc>
@@ -740,7 +794,7 @@
           </w:tcPr>
           <w:p>
             <w:r>
-              <w:t>78/100</w:t>
+              <w:t>70/100 (Strategic)</w:t>
             </w:r>
           </w:p>
         </w:tc>
@@ -751,77 +805,7 @@
           </w:tcPr>
           <w:p>
             <w:r>
-              <w:t>ICRA-rated; stable outlook; healthy debt protection metrics</w:t>
-            </w:r>
-          </w:p>
-        </w:tc>
-      </w:tr>
-      <w:tr>
-        <w:tc>
-          <w:tcPr>
-            <w:tcW w:type="dxa" w:w="3135"/>
-            <w:shd w:val="clear" w:color="auto" w:fill="D5E8D4"/>
-          </w:tcPr>
-          <w:p>
-            <w:r>
-              <w:t>SL05: Strategic Direction</w:t>
-            </w:r>
-          </w:p>
-        </w:tc>
-        <w:tc>
-          <w:tcPr>
-            <w:tcW w:type="dxa" w:w="3135"/>
-            <w:shd w:val="clear" w:color="auto" w:fill="D5E8D4"/>
-          </w:tcPr>
-          <w:p>
-            <w:r>
-              <w:t>82/100</w:t>
-            </w:r>
-          </w:p>
-        </w:tc>
-        <w:tc>
-          <w:tcPr>
-            <w:tcW w:type="dxa" w:w="3135"/>
-            <w:shd w:val="clear" w:color="auto" w:fill="D5E8D4"/>
-          </w:tcPr>
-          <w:p>
-            <w:r>
-              <w:t>Industry 4.0 pivot: electric actuators, robotics, sensors added</w:t>
-            </w:r>
-          </w:p>
-        </w:tc>
-      </w:tr>
-      <w:tr>
-        <w:tc>
-          <w:tcPr>
-            <w:tcW w:type="dxa" w:w="3135"/>
-            <w:shd w:val="clear" w:color="auto" w:fill="D5E8D4"/>
-          </w:tcPr>
-          <w:p>
-            <w:r>
-              <w:t>SL06: Global Presence</w:t>
-            </w:r>
-          </w:p>
-        </w:tc>
-        <w:tc>
-          <w:tcPr>
-            <w:tcW w:type="dxa" w:w="3135"/>
-            <w:shd w:val="clear" w:color="auto" w:fill="D5E8D4"/>
-          </w:tcPr>
-          <w:p>
-            <w:r>
-              <w:t>88/100</w:t>
-            </w:r>
-          </w:p>
-        </w:tc>
-        <w:tc>
-          <w:tcPr>
-            <w:tcW w:type="dxa" w:w="3135"/>
-            <w:shd w:val="clear" w:color="auto" w:fill="D5E8D4"/>
-          </w:tcPr>
-          <w:p>
-            <w:r>
-              <w:t>42+ countries; USA and Germany subsidiaries; 200 global distribution partners</w:t>
+              <w:t>Incremental product digitization active; no IP trail, open innovation, or startup signals</w:t>
             </w:r>
           </w:p>
         </w:tc>
@@ -841,27 +825,22 @@
         <w:rPr>
           <w:color w:val="1F3864"/>
         </w:rPr>
-        <w:t>3. Sales &amp; Marketing (Score: 78/100 — Strong)</w:t>
+        <w:t>3. Operations &amp; Supply Chain (Score: 65/100 — Siloed)</w:t>
       </w:r>
     </w:p>
     <w:p>
       <w:r>
-        <w:t>Janatics' sales and marketing profile is characterized by exceptional customer diversity and distribution breadth, partially tempered by revenue growth trailing industry pace.</w:t>
+        <w:t>Janatics operates a world-class physical manufacturing infrastructure — a 70,000 square meter primary facility in Coimbatore with CNC machining centers, casting operations, and surface treatment lines, supported by additional plants in Ahmedabad and Noida. Physical process automation is well established, and the company's ICRA-noted regulatory compliance suggests mature quality management practices.</w:t>
       </w:r>
     </w:p>
     <w:p>
       <w:r>
-        <w:t>The company serves 17,000+ customers across seven end-use industries — pharmaceuticals, automotive, packaging, printing, food processing, medical equipment, and textiles. This diversification insulates revenues from sector-specific cyclicality. The global distribution network of 200+ partners enables market access without proportionate fixed-cost overhead.</w:t>
+        <w:t>The digital operations layer, however, is a significant gap based on public evidence. No disclosures of ERP adoption, manufacturing execution systems (MES), supply chain visibility platforms, or real-time production monitoring have been identified. While the company's Industry 4.0 product portfolio demonstrates awareness of smart manufacturing concepts, the extent to which these are applied to Janatics' own production environment is not evidenced.</w:t>
       </w:r>
     </w:p>
     <w:p>
       <w:r>
-        <w:t>Revenue grew from ₹507.9 Cr (FY2024) to ₹527.8 Cr (FY2025), a 4% YoY increase — below the industry CAGR of 6.9%. This suggests either deliberate margin-over-volume positioning or competitive pressure from global players (SMC Corporation, Festo, Parker Hannifin) in the premium segment. The company operates under its own brand, Janatics, which commands recognition within AIA India member circles and among OEM procurement teams.</w:t>
-      </w:r>
-    </w:p>
-    <w:p>
-      <w:r>
-        <w:t>A digital commerce and direct-to-customer channel strategy is not evidenced in public disclosures — a potential growth lever not yet activated.</w:t>
+        <w:t>The Operations &amp; Supply Chain dimension scores 65/100 (Siloed), reflecting strong physical automation but unquantified internal digitization. The key opportunity is leveraging the company's own I4.0 product expertise to digitize internal manufacturing — a credibility and efficiency lever that would simultaneously serve as product validation.</w:t>
       </w:r>
     </w:p>
     <w:p/>
@@ -873,8 +852,8 @@
       </w:tblPr>
       <w:tblGrid>
         <w:gridCol w:w="2835"/>
-        <w:gridCol w:w="1134"/>
-        <w:gridCol w:w="5669"/>
+        <w:gridCol w:w="1701"/>
+        <w:gridCol w:w="5102"/>
       </w:tblGrid>
       <w:tr>
         <w:tc>
@@ -918,7 +897,7 @@
                 <w:b/>
                 <w:color w:val="FFFFFF"/>
               </w:rPr>
-              <w:t>Evidence</w:t>
+              <w:t>Public Signal / Evidence</w:t>
             </w:r>
           </w:p>
         </w:tc>
@@ -931,7 +910,7 @@
           </w:tcPr>
           <w:p>
             <w:r>
-              <w:t>SM01: Revenue Growth vs Industry CAGR</w:t>
+              <w:t>OSC01: Digital Manufacturing Readiness</w:t>
             </w:r>
           </w:p>
         </w:tc>
@@ -942,7 +921,7 @@
           </w:tcPr>
           <w:p>
             <w:r>
-              <w:t>55/100</w:t>
+              <w:t>60/100 (Siloed)</w:t>
             </w:r>
           </w:p>
         </w:tc>
@@ -953,7 +932,42 @@
           </w:tcPr>
           <w:p>
             <w:r>
-              <w:t>4% YoY vs 6.9% sector CAGR — below market pace</w:t>
+              <w:t>70,000 sqm Coimbatore plant with CNC; no I4.0 cert or smart factory disclosure found</w:t>
+            </w:r>
+          </w:p>
+        </w:tc>
+      </w:tr>
+      <w:tr>
+        <w:tc>
+          <w:tcPr>
+            <w:tcW w:type="dxa" w:w="3135"/>
+            <w:shd w:val="clear" w:color="auto" w:fill="FFF2CC"/>
+          </w:tcPr>
+          <w:p>
+            <w:r>
+              <w:t>OSC02: Supply Chain Visibility Tools</w:t>
+            </w:r>
+          </w:p>
+        </w:tc>
+        <w:tc>
+          <w:tcPr>
+            <w:tcW w:type="dxa" w:w="3135"/>
+            <w:shd w:val="clear" w:color="auto" w:fill="FFF2CC"/>
+          </w:tcPr>
+          <w:p>
+            <w:r>
+              <w:t>50/100 (Siloed)</w:t>
+            </w:r>
+          </w:p>
+        </w:tc>
+        <w:tc>
+          <w:tcPr>
+            <w:tcW w:type="dxa" w:w="3135"/>
+            <w:shd w:val="clear" w:color="auto" w:fill="FFF2CC"/>
+          </w:tcPr>
+          <w:p>
+            <w:r>
+              <w:t>No ERP, SCM platform, or supply chain digitization initiative disclosed publicly</w:t>
             </w:r>
           </w:p>
         </w:tc>
@@ -966,7 +980,7 @@
           </w:tcPr>
           <w:p>
             <w:r>
-              <w:t>SM02: Revenue Scale</w:t>
+              <w:t>OSC03: Process Automation Adoption</w:t>
             </w:r>
           </w:p>
         </w:tc>
@@ -977,7 +991,7 @@
           </w:tcPr>
           <w:p>
             <w:r>
-              <w:t>80/100</w:t>
+              <w:t>70/100 (Strategic)</w:t>
             </w:r>
           </w:p>
         </w:tc>
@@ -988,7 +1002,7 @@
           </w:tcPr>
           <w:p>
             <w:r>
-              <w:t>₹531 Cr FY2025; consistent ₹500 Cr+ for 2 consecutive years</w:t>
+              <w:t>CNC machining, casting automation, surface treatment — physical automation well established</w:t>
             </w:r>
           </w:p>
         </w:tc>
@@ -1001,7 +1015,7 @@
           </w:tcPr>
           <w:p>
             <w:r>
-              <w:t>SM03: Customer Diversity</w:t>
+              <w:t>OSC04: Quality Management (Digital)</w:t>
             </w:r>
           </w:p>
         </w:tc>
@@ -1012,7 +1026,7 @@
           </w:tcPr>
           <w:p>
             <w:r>
-              <w:t>90/100</w:t>
+              <w:t>72/100 (Strategic)</w:t>
             </w:r>
           </w:p>
         </w:tc>
@@ -1023,7 +1037,7 @@
           </w:tcPr>
           <w:p>
             <w:r>
-              <w:t>17,000+ customers; 7 industries; low single-customer concentration risk</w:t>
+              <w:t>ICRA notes consistent compliance; ISO quality system assumed but not publicly confirmed</w:t>
             </w:r>
           </w:p>
         </w:tc>
@@ -1036,7 +1050,7 @@
           </w:tcPr>
           <w:p>
             <w:r>
-              <w:t>SM04: Distribution Network</w:t>
+              <w:t>OSC05: Industry 4.0 Integration</w:t>
             </w:r>
           </w:p>
         </w:tc>
@@ -1047,7 +1061,7 @@
           </w:tcPr>
           <w:p>
             <w:r>
-              <w:t>85/100</w:t>
+              <w:t>73/100 (Strategic)</w:t>
             </w:r>
           </w:p>
         </w:tc>
@@ -1058,42 +1072,7 @@
           </w:tcPr>
           <w:p>
             <w:r>
-              <w:t>200 global partners; 3 manufacturing plants for regional reach</w:t>
-            </w:r>
-          </w:p>
-        </w:tc>
-      </w:tr>
-      <w:tr>
-        <w:tc>
-          <w:tcPr>
-            <w:tcW w:type="dxa" w:w="3135"/>
-            <w:shd w:val="clear" w:color="auto" w:fill="D5E8D4"/>
-          </w:tcPr>
-          <w:p>
-            <w:r>
-              <w:t>SM05: Brand Strength</w:t>
-            </w:r>
-          </w:p>
-        </w:tc>
-        <w:tc>
-          <w:tcPr>
-            <w:tcW w:type="dxa" w:w="3135"/>
-            <w:shd w:val="clear" w:color="auto" w:fill="D5E8D4"/>
-          </w:tcPr>
-          <w:p>
-            <w:r>
-              <w:t>80/100</w:t>
-            </w:r>
-          </w:p>
-        </w:tc>
-        <w:tc>
-          <w:tcPr>
-            <w:tcW w:type="dxa" w:w="3135"/>
-            <w:shd w:val="clear" w:color="auto" w:fill="D5E8D4"/>
-          </w:tcPr>
-          <w:p>
-            <w:r>
-              <w:t>49-year brand; AIA India member; DSIR-recognized R&amp;D</w:t>
+              <w:t>I4.0 product portfolio exists; internal adoption for own manufacturing not disclosed</w:t>
             </w:r>
           </w:p>
         </w:tc>
@@ -1113,27 +1092,22 @@
         <w:rPr>
           <w:color w:val="1F3864"/>
         </w:rPr>
-        <w:t>4. Operations &amp; Supply Chain (Score: 78/100 — Strong)</w:t>
+        <w:t>4. Sales &amp; Marketing (Score: 55/100 — Siloed)</w:t>
       </w:r>
     </w:p>
     <w:p>
       <w:r>
-        <w:t>Janatics operates one of the largest dedicated pneumatics manufacturing facilities in India — a 70,000 square meter plant in Coimbatore equipped with casting equipment, CNC machining centers, and surface treatment lines. Additional plants in Ahmedabad and Noida provide regional manufacturing flexibility and reduce logistics lead times for northern and western markets.</w:t>
+        <w:t>Janatics' digital sales and marketing footprint is the lowest-scoring dimension, reflecting a largely traditional go-to-market model reliant on distribution partners and direct OEM relationships rather than digital channels. The company maintains two product-oriented websites (janatics.com and janaticspneumatics.com) with online catalogs, but no B2B e-commerce capability, digital ordering portal, or real-time pricing has been evidenced.</w:t>
       </w:r>
     </w:p>
     <w:p>
       <w:r>
-        <w:t>The product portfolio exceeds 3,500 distinct SKUs spanning pneumatic cylinders, directional control valves, FRL (Filter-Regulator-Lubricator) units, solenoid valves, one-touch fittings, and didactic automation equipment. This breadth enables Janatics to serve as a single-source supplier for OEM customers — a significant procurement advantage.</w:t>
+        <w:t>Social media engagement is minimal based on public signals — limited LinkedIn activity and no evidence of paid digital marketing, content strategy, or SEO investment has been identified. This is a meaningful gap given that industrial buyers increasingly begin procurement journeys digitally, and global competitors such as SMC Corporation and Festo invest heavily in digital commerce and demand generation.</w:t>
       </w:r>
     </w:p>
     <w:p>
       <w:r>
-        <w:t>The DSIR-recognized R&amp;D division underpins product development velocity and differentiates Janatics from purely assembly-based competitors. The company's expansion into electric actuators and robotics signals investment in manufacturing capabilities beyond legacy pneumatics.</w:t>
-      </w:r>
-    </w:p>
-    <w:p>
-      <w:r>
-        <w:t>The principal operational risk is internal digitization transparency — ERP systems, supply chain visibility tools, and manufacturing execution systems are not disclosed, limiting the ability to score OSC05 (digitization) with confidence.</w:t>
+        <w:t>The positive factor in this dimension is the company's managed customer base — 17,000+ customers across seven industries implies some form of structured customer data management, though the tools enabling this are not disclosed. The Sales &amp; Marketing dimension scores 55/100 (Siloed), with the largest uplift opportunity lying in activating a digital sales channel and structured social/content presence.</w:t>
       </w:r>
     </w:p>
     <w:p/>
@@ -1145,8 +1119,8 @@
       </w:tblPr>
       <w:tblGrid>
         <w:gridCol w:w="2835"/>
-        <w:gridCol w:w="1134"/>
-        <w:gridCol w:w="5669"/>
+        <w:gridCol w:w="1701"/>
+        <w:gridCol w:w="5102"/>
       </w:tblGrid>
       <w:tr>
         <w:tc>
@@ -1190,7 +1164,147 @@
                 <w:b/>
                 <w:color w:val="FFFFFF"/>
               </w:rPr>
-              <w:t>Evidence</w:t>
+              <w:t>Public Signal / Evidence</w:t>
+            </w:r>
+          </w:p>
+        </w:tc>
+      </w:tr>
+      <w:tr>
+        <w:tc>
+          <w:tcPr>
+            <w:tcW w:type="dxa" w:w="3135"/>
+            <w:shd w:val="clear" w:color="auto" w:fill="FFF2CC"/>
+          </w:tcPr>
+          <w:p>
+            <w:r>
+              <w:t>SM01: Digital Presence &amp; SEO</w:t>
+            </w:r>
+          </w:p>
+        </w:tc>
+        <w:tc>
+          <w:tcPr>
+            <w:tcW w:type="dxa" w:w="3135"/>
+            <w:shd w:val="clear" w:color="auto" w:fill="FFF2CC"/>
+          </w:tcPr>
+          <w:p>
+            <w:r>
+              <w:t>60/100 (Siloed)</w:t>
+            </w:r>
+          </w:p>
+        </w:tc>
+        <w:tc>
+          <w:tcPr>
+            <w:tcW w:type="dxa" w:w="3135"/>
+            <w:shd w:val="clear" w:color="auto" w:fill="FFF2CC"/>
+          </w:tcPr>
+          <w:p>
+            <w:r>
+              <w:t>Two product websites with online catalog; SEO signals moderate; no digital engagement tools</w:t>
+            </w:r>
+          </w:p>
+        </w:tc>
+      </w:tr>
+      <w:tr>
+        <w:tc>
+          <w:tcPr>
+            <w:tcW w:type="dxa" w:w="3135"/>
+            <w:shd w:val="clear" w:color="auto" w:fill="FFF2CC"/>
+          </w:tcPr>
+          <w:p>
+            <w:r>
+              <w:t>SM02: Social Media Engagement</w:t>
+            </w:r>
+          </w:p>
+        </w:tc>
+        <w:tc>
+          <w:tcPr>
+            <w:tcW w:type="dxa" w:w="3135"/>
+            <w:shd w:val="clear" w:color="auto" w:fill="FFF2CC"/>
+          </w:tcPr>
+          <w:p>
+            <w:r>
+              <w:t>40/100 (Siloed)</w:t>
+            </w:r>
+          </w:p>
+        </w:tc>
+        <w:tc>
+          <w:tcPr>
+            <w:tcW w:type="dxa" w:w="3135"/>
+            <w:shd w:val="clear" w:color="auto" w:fill="FFF2CC"/>
+          </w:tcPr>
+          <w:p>
+            <w:r>
+              <w:t>Limited LinkedIn activity; no active social media marketing strategy evidenced</w:t>
+            </w:r>
+          </w:p>
+        </w:tc>
+      </w:tr>
+      <w:tr>
+        <w:tc>
+          <w:tcPr>
+            <w:tcW w:type="dxa" w:w="3135"/>
+            <w:shd w:val="clear" w:color="auto" w:fill="FFF2CC"/>
+          </w:tcPr>
+          <w:p>
+            <w:r>
+              <w:t>SM03: E-commerce / Digital Ordering</w:t>
+            </w:r>
+          </w:p>
+        </w:tc>
+        <w:tc>
+          <w:tcPr>
+            <w:tcW w:type="dxa" w:w="3135"/>
+            <w:shd w:val="clear" w:color="auto" w:fill="FFF2CC"/>
+          </w:tcPr>
+          <w:p>
+            <w:r>
+              <w:t>45/100 (Siloed)</w:t>
+            </w:r>
+          </w:p>
+        </w:tc>
+        <w:tc>
+          <w:tcPr>
+            <w:tcW w:type="dxa" w:w="3135"/>
+            <w:shd w:val="clear" w:color="auto" w:fill="FFF2CC"/>
+          </w:tcPr>
+          <w:p>
+            <w:r>
+              <w:t>No B2B e-commerce, digital ordering portal, or online pricing catalog identified</w:t>
+            </w:r>
+          </w:p>
+        </w:tc>
+      </w:tr>
+      <w:tr>
+        <w:tc>
+          <w:tcPr>
+            <w:tcW w:type="dxa" w:w="3135"/>
+            <w:shd w:val="clear" w:color="auto" w:fill="FFF2CC"/>
+          </w:tcPr>
+          <w:p>
+            <w:r>
+              <w:t>SM04: Digital Marketing Activity</w:t>
+            </w:r>
+          </w:p>
+        </w:tc>
+        <w:tc>
+          <w:tcPr>
+            <w:tcW w:type="dxa" w:w="3135"/>
+            <w:shd w:val="clear" w:color="auto" w:fill="FFF2CC"/>
+          </w:tcPr>
+          <w:p>
+            <w:r>
+              <w:t>55/100 (Siloed)</w:t>
+            </w:r>
+          </w:p>
+        </w:tc>
+        <w:tc>
+          <w:tcPr>
+            <w:tcW w:type="dxa" w:w="3135"/>
+            <w:shd w:val="clear" w:color="auto" w:fill="FFF2CC"/>
+          </w:tcPr>
+          <w:p>
+            <w:r>
+              <w:t>Websites established; no paid search, content marketing, or digital ad activity evidenced</w:t>
             </w:r>
           </w:p>
         </w:tc>
@@ -1203,7 +1317,7 @@
           </w:tcPr>
           <w:p>
             <w:r>
-              <w:t>OSC01: Manufacturing Scale</w:t>
+              <w:t>SM05: CRM &amp; Customer Data Utilization</w:t>
             </w:r>
           </w:p>
         </w:tc>
@@ -1214,7 +1328,7 @@
           </w:tcPr>
           <w:p>
             <w:r>
-              <w:t>85/100</w:t>
+              <w:t>75/100 (Strategic)</w:t>
             </w:r>
           </w:p>
         </w:tc>
@@ -1225,147 +1339,7 @@
           </w:tcPr>
           <w:p>
             <w:r>
-              <w:t>70,000 sqm Coimbatore HQ; Ahmedabad and Noida plants</w:t>
-            </w:r>
-          </w:p>
-        </w:tc>
-      </w:tr>
-      <w:tr>
-        <w:tc>
-          <w:tcPr>
-            <w:tcW w:type="dxa" w:w="3135"/>
-            <w:shd w:val="clear" w:color="auto" w:fill="D5E8D4"/>
-          </w:tcPr>
-          <w:p>
-            <w:r>
-              <w:t>OSC02: Product Portfolio Breadth</w:t>
-            </w:r>
-          </w:p>
-        </w:tc>
-        <w:tc>
-          <w:tcPr>
-            <w:tcW w:type="dxa" w:w="3135"/>
-            <w:shd w:val="clear" w:color="auto" w:fill="D5E8D4"/>
-          </w:tcPr>
-          <w:p>
-            <w:r>
-              <w:t>90/100</w:t>
-            </w:r>
-          </w:p>
-        </w:tc>
-        <w:tc>
-          <w:tcPr>
-            <w:tcW w:type="dxa" w:w="3135"/>
-            <w:shd w:val="clear" w:color="auto" w:fill="D5E8D4"/>
-          </w:tcPr>
-          <w:p>
-            <w:r>
-              <w:t>3,500+ distinct products across multiple automation categories</w:t>
-            </w:r>
-          </w:p>
-        </w:tc>
-      </w:tr>
-      <w:tr>
-        <w:tc>
-          <w:tcPr>
-            <w:tcW w:type="dxa" w:w="3135"/>
-            <w:shd w:val="clear" w:color="auto" w:fill="D5E8D4"/>
-          </w:tcPr>
-          <w:p>
-            <w:r>
-              <w:t>OSC03: R&amp;D &amp; Technology</w:t>
-            </w:r>
-          </w:p>
-        </w:tc>
-        <w:tc>
-          <w:tcPr>
-            <w:tcW w:type="dxa" w:w="3135"/>
-            <w:shd w:val="clear" w:color="auto" w:fill="D5E8D4"/>
-          </w:tcPr>
-          <w:p>
-            <w:r>
-              <w:t>82/100</w:t>
-            </w:r>
-          </w:p>
-        </w:tc>
-        <w:tc>
-          <w:tcPr>
-            <w:tcW w:type="dxa" w:w="3135"/>
-            <w:shd w:val="clear" w:color="auto" w:fill="D5E8D4"/>
-          </w:tcPr>
-          <w:p>
-            <w:r>
-              <w:t>DSIR-recognized R&amp;D; CNC and casting; robotics expansion underway</w:t>
-            </w:r>
-          </w:p>
-        </w:tc>
-      </w:tr>
-      <w:tr>
-        <w:tc>
-          <w:tcPr>
-            <w:tcW w:type="dxa" w:w="3135"/>
-            <w:shd w:val="clear" w:color="auto" w:fill="FFF2CC"/>
-          </w:tcPr>
-          <w:p>
-            <w:r>
-              <w:t>OSC04: GST &amp; Regulatory Compliance</w:t>
-            </w:r>
-          </w:p>
-        </w:tc>
-        <w:tc>
-          <w:tcPr>
-            <w:tcW w:type="dxa" w:w="3135"/>
-            <w:shd w:val="clear" w:color="auto" w:fill="FFF2CC"/>
-          </w:tcPr>
-          <w:p>
-            <w:r>
-              <w:t>72/100</w:t>
-            </w:r>
-          </w:p>
-        </w:tc>
-        <w:tc>
-          <w:tcPr>
-            <w:tcW w:type="dxa" w:w="3135"/>
-            <w:shd w:val="clear" w:color="auto" w:fill="FFF2CC"/>
-          </w:tcPr>
-          <w:p>
-            <w:r>
-              <w:t>Active GST entity; ICRA notes consistent compliance track record</w:t>
-            </w:r>
-          </w:p>
-        </w:tc>
-      </w:tr>
-      <w:tr>
-        <w:tc>
-          <w:tcPr>
-            <w:tcW w:type="dxa" w:w="3135"/>
-            <w:shd w:val="clear" w:color="auto" w:fill="FFF2CC"/>
-          </w:tcPr>
-          <w:p>
-            <w:r>
-              <w:t>OSC05: Supply Chain Digitization</w:t>
-            </w:r>
-          </w:p>
-        </w:tc>
-        <w:tc>
-          <w:tcPr>
-            <w:tcW w:type="dxa" w:w="3135"/>
-            <w:shd w:val="clear" w:color="auto" w:fill="FFF2CC"/>
-          </w:tcPr>
-          <w:p>
-            <w:r>
-              <w:t>65/100</w:t>
-            </w:r>
-          </w:p>
-        </w:tc>
-        <w:tc>
-          <w:tcPr>
-            <w:tcW w:type="dxa" w:w="3135"/>
-            <w:shd w:val="clear" w:color="auto" w:fill="FFF2CC"/>
-          </w:tcPr>
-          <w:p>
-            <w:r>
-              <w:t>Industry 4.0 product range present; internal digitization undisclosed</w:t>
+              <w:t>17,000+ customers across 7 industries implies structured data management; CRM tool undisclosed</w:t>
             </w:r>
           </w:p>
         </w:tc>
@@ -1385,27 +1359,22 @@
         <w:rPr>
           <w:color w:val="1F3864"/>
         </w:rPr>
-        <w:t>5. Finance (Score: 67/100 — Moderate)</w:t>
+        <w:t>5. Technology Adoption (Score: 70/100 — Strategic)</w:t>
       </w:r>
     </w:p>
     <w:p>
       <w:r>
-        <w:t>Janatics' financial profile is characterized by strong absolute scale and robust credit metrics, but flagged by EBITDA margin compression in FY2025 that warrants close monitoring.</w:t>
+        <w:t>Technology Adoption is the strongest-performing dimension alongside Strategy, driven primarily by Janatics' product-layer digitization. The company's DSIR-recognized R&amp;D division is actively developing robotic systems, smart sensors, electric actuators, and Industry 4.0 didactic equipment — a portfolio that places Janatics at the intersection of physical and digital manufacturing technology.</w:t>
       </w:r>
     </w:p>
     <w:p>
       <w:r>
-        <w:t>Revenue of ₹531 Crore in FY2025 positions the company solidly in the mid-large tier of domestic manufacturers, with employee productivity of approximately ₹80 lakh per employee — reasonable for a capital-intensive manufacturing operation. The capital structure is conservative: authorized capital of ₹30 Cr against paid-up capital of ₹26.5 Cr, with no external equity funding rounds identified.</w:t>
+        <w:t>The internal technology infrastructure, however, presents a more mixed picture. The company's websites are functional but do not reflect a modern digital architecture. No cloud migration, SaaS platform adoption, or digital collaboration tool deployment has been publicly evidenced. Cybersecurity and data governance practices are consistent with ICRA compliance requirements but no formal cybersecurity framework, ISO 27001 certification, or data privacy policy is publicly disclosed.</w:t>
       </w:r>
     </w:p>
     <w:p>
       <w:r>
-        <w:t>The ICRA credit rating with a Stable outlook and repeated reaffirmations over multiple years is the single most significant positive signal in this dimension — it validates balance sheet health, debt servicing capacity, and management quality from an independent third party.</w:t>
-      </w:r>
-    </w:p>
-    <w:p>
-      <w:r>
-        <w:t>The primary concern is a reported 1-year EBITDA CAGR of -22%. While a single-year EBITDA decline can reflect input cost inflation, wage increases, or capital expenditure absorption, it represents a meaningful deviation from prior profitability levels. Full P&amp;L and balance sheet data (not publicly available for unlisted private companies) would be needed for a definitive financial assessment.</w:t>
+        <w:t>The Technology Adoption dimension scores 70/100 (Siloed), with the R&amp;D product portfolio as the primary positive signal. Converting this product expertise into internal infrastructure modernization — cloud adoption, digital twin capabilities, predictive maintenance systems — would represent a natural and credibility-enhancing next step.</w:t>
       </w:r>
     </w:p>
     <w:p/>
@@ -1417,8 +1386,8 @@
       </w:tblPr>
       <w:tblGrid>
         <w:gridCol w:w="2835"/>
-        <w:gridCol w:w="1134"/>
-        <w:gridCol w:w="5669"/>
+        <w:gridCol w:w="1701"/>
+        <w:gridCol w:w="5102"/>
       </w:tblGrid>
       <w:tr>
         <w:tc>
@@ -1462,7 +1431,42 @@
                 <w:b/>
                 <w:color w:val="FFFFFF"/>
               </w:rPr>
-              <w:t>Evidence</w:t>
+              <w:t>Public Signal / Evidence</w:t>
+            </w:r>
+          </w:p>
+        </w:tc>
+      </w:tr>
+      <w:tr>
+        <w:tc>
+          <w:tcPr>
+            <w:tcW w:type="dxa" w:w="3135"/>
+            <w:shd w:val="clear" w:color="auto" w:fill="FFF2CC"/>
+          </w:tcPr>
+          <w:p>
+            <w:r>
+              <w:t>TA01: Website &amp; Digital Infrastructure</w:t>
+            </w:r>
+          </w:p>
+        </w:tc>
+        <w:tc>
+          <w:tcPr>
+            <w:tcW w:type="dxa" w:w="3135"/>
+            <w:shd w:val="clear" w:color="auto" w:fill="FFF2CC"/>
+          </w:tcPr>
+          <w:p>
+            <w:r>
+              <w:t>65/100 (Siloed)</w:t>
+            </w:r>
+          </w:p>
+        </w:tc>
+        <w:tc>
+          <w:tcPr>
+            <w:tcW w:type="dxa" w:w="3135"/>
+            <w:shd w:val="clear" w:color="auto" w:fill="FFF2CC"/>
+          </w:tcPr>
+          <w:p>
+            <w:r>
+              <w:t>Functional product websites; no modern tech stack, API integrations, or customer portal evidence</w:t>
             </w:r>
           </w:p>
         </w:tc>
@@ -1475,7 +1479,7 @@
           </w:tcPr>
           <w:p>
             <w:r>
-              <w:t>FIN01: Revenue Scale</w:t>
+              <w:t>TA02: IoT / Smart Product Portfolio</w:t>
             </w:r>
           </w:p>
         </w:tc>
@@ -1486,7 +1490,7 @@
           </w:tcPr>
           <w:p>
             <w:r>
-              <w:t>80/100</w:t>
+              <w:t>80/100 (Strategic)</w:t>
             </w:r>
           </w:p>
         </w:tc>
@@ -1497,7 +1501,7 @@
           </w:tcPr>
           <w:p>
             <w:r>
-              <w:t>₹531 Cr FY2025 — strong for unlisted domestic manufacturer</w:t>
+              <w:t>Electric actuators, smart sensors, robotics, I4.0 didactics — strong product-layer digitization</w:t>
             </w:r>
           </w:p>
         </w:tc>
@@ -1510,7 +1514,7 @@
           </w:tcPr>
           <w:p>
             <w:r>
-              <w:t>FIN02: Revenue Growth (4% YoY)</w:t>
+              <w:t>TA03: Cloud &amp; SaaS Adoption</w:t>
             </w:r>
           </w:p>
         </w:tc>
@@ -1521,7 +1525,7 @@
           </w:tcPr>
           <w:p>
             <w:r>
-              <w:t>55/100</w:t>
+              <w:t>60/100 (Siloed)</w:t>
             </w:r>
           </w:p>
         </w:tc>
@@ -1532,42 +1536,7 @@
           </w:tcPr>
           <w:p>
             <w:r>
-              <w:t>FY24→FY25 growth 4%; below industry but within inflation-adjusted range</w:t>
-            </w:r>
-          </w:p>
-        </w:tc>
-      </w:tr>
-      <w:tr>
-        <w:tc>
-          <w:tcPr>
-            <w:tcW w:type="dxa" w:w="3135"/>
-            <w:shd w:val="clear" w:color="auto" w:fill="F8CECC"/>
-          </w:tcPr>
-          <w:p>
-            <w:r>
-              <w:t>FIN03: EBITDA Trajectory</w:t>
-            </w:r>
-          </w:p>
-        </w:tc>
-        <w:tc>
-          <w:tcPr>
-            <w:tcW w:type="dxa" w:w="3135"/>
-            <w:shd w:val="clear" w:color="auto" w:fill="F8CECC"/>
-          </w:tcPr>
-          <w:p>
-            <w:r>
-              <w:t>42/100</w:t>
-            </w:r>
-          </w:p>
-        </w:tc>
-        <w:tc>
-          <w:tcPr>
-            <w:tcW w:type="dxa" w:w="3135"/>
-            <w:shd w:val="clear" w:color="auto" w:fill="F8CECC"/>
-          </w:tcPr>
-          <w:p>
-            <w:r>
-              <w:t>EBITDA CAGR -22% (1-yr, Tracxn) — margin compression; requires full P&amp;L review</w:t>
+              <w:t>No public cloud migration, SaaS tools, or digital collaboration platform disclosures found</w:t>
             </w:r>
           </w:p>
         </w:tc>
@@ -1580,7 +1549,7 @@
           </w:tcPr>
           <w:p>
             <w:r>
-              <w:t>FIN04: Credit Profile (ICRA)</w:t>
+              <w:t>TA04: R&amp;D in Digital / Smart Tech</w:t>
             </w:r>
           </w:p>
         </w:tc>
@@ -1591,7 +1560,7 @@
           </w:tcPr>
           <w:p>
             <w:r>
-              <w:t>82/100</w:t>
+              <w:t>78/100 (Strategic)</w:t>
             </w:r>
           </w:p>
         </w:tc>
@@ -1602,7 +1571,7 @@
           </w:tcPr>
           <w:p>
             <w:r>
-              <w:t>ICRA-rated; stable; healthy debt protection metrics; multiple reaffirmations</w:t>
+              <w:t>DSIR-recognized R&amp;D developing robotic systems, sensors, and smart automation equipment</w:t>
             </w:r>
           </w:p>
         </w:tc>
@@ -1615,7 +1584,7 @@
           </w:tcPr>
           <w:p>
             <w:r>
-              <w:t>FIN05: Capital Structure</w:t>
+              <w:t>TA05: Cybersecurity &amp; Data Practices</w:t>
             </w:r>
           </w:p>
         </w:tc>
@@ -1626,7 +1595,7 @@
           </w:tcPr>
           <w:p>
             <w:r>
-              <w:t>75/100</w:t>
+              <w:t>67/100 (Strategic)</w:t>
             </w:r>
           </w:p>
         </w:tc>
@@ -1637,42 +1606,7 @@
           </w:tcPr>
           <w:p>
             <w:r>
-              <w:t>Auth. ₹30 Cr; paid-up ₹26.5 Cr; no external equity; self-funded growth</w:t>
-            </w:r>
-          </w:p>
-        </w:tc>
-      </w:tr>
-      <w:tr>
-        <w:tc>
-          <w:tcPr>
-            <w:tcW w:type="dxa" w:w="3135"/>
-            <w:shd w:val="clear" w:color="auto" w:fill="FFF2CC"/>
-          </w:tcPr>
-          <w:p>
-            <w:r>
-              <w:t>FIN06: Employee Productivity</w:t>
-            </w:r>
-          </w:p>
-        </w:tc>
-        <w:tc>
-          <w:tcPr>
-            <w:tcW w:type="dxa" w:w="3135"/>
-            <w:shd w:val="clear" w:color="auto" w:fill="FFF2CC"/>
-          </w:tcPr>
-          <w:p>
-            <w:r>
-              <w:t>70/100</w:t>
-            </w:r>
-          </w:p>
-        </w:tc>
-        <w:tc>
-          <w:tcPr>
-            <w:tcW w:type="dxa" w:w="3135"/>
-            <w:shd w:val="clear" w:color="auto" w:fill="FFF2CC"/>
-          </w:tcPr>
-          <w:p>
-            <w:r>
-              <w:t>662 employees; ₹531 Cr revenue = ~₹80L per employee</w:t>
+              <w:t>ICRA-compliant; no public cybersecurity framework, ISO 27001, or data policy disclosed</w:t>
             </w:r>
           </w:p>
         </w:tc>
@@ -1692,22 +1626,22 @@
         <w:rPr>
           <w:color w:val="1F3864"/>
         </w:rPr>
-        <w:t>6. Industry Context (Score: 75/100 — Strong)</w:t>
+        <w:t>6. Skills &amp; Capabilities (Score: 60/100 — Siloed)</w:t>
       </w:r>
     </w:p>
     <w:p>
       <w:r>
-        <w:t>The Indian pneumatics and industrial automation market presents a favourable medium-term backdrop for Janatics. The India pneumatic equipment market stood at $1.06 billion in 2024 and is projected to reach $1.94 billion by 2033 (CAGR: 6.9%), driven by manufacturing automation adoption, infrastructure build-out, and the Make in India policy framework.</w:t>
+        <w:t>Janatics' workforce of 662 employees is engineering-deep, with strong mechanical and manufacturing expertise anchoring the company's operational excellence. The DSIR-recognized R&amp;D division implies a structured technical team capable of product innovation. CNC machining specialists and automation engineers form the core talent base.</w:t>
       </w:r>
     </w:p>
     <w:p>
       <w:r>
-        <w:t>Janatics is well-positioned relative to these tailwinds. Its manufacturing base in India aligns with the government's Production Linked Incentive (PLI) schemes for advanced manufacturing. The China+1 sourcing strategy adopted by global OEMs creates incremental export demand for quality Indian component manufacturers — a direct opportunity for Janatics given its existing presence in 42 countries.</w:t>
+        <w:t>Digital talent acquisition signals, however, are limited from public sources. No evidence of software engineers, data scientists, digital marketing roles, or cloud architecture hires has been identified. Digital training and upskilling programs are not publicly disclosed, and no innovation culture signals — such as internal hackathons, incubation programs, or startup partnerships — have been evidenced.</w:t>
       </w:r>
     </w:p>
     <w:p>
       <w:r>
-        <w:t>Competitive intensity is the key contextual risk. SMC Corporation (Japan), Festo (Germany), and Parker Hannifin (USA) dominate the premium pneumatics segment globally and are present in India. Janatics competes primarily on price-quality positioning in the mid-market, where it has a strong installed base. Defending this position as global players intensify localization will be the central competitive challenge in the next 3–5 years.</w:t>
+        <w:t>Leadership demonstrates digital awareness through product decisions but no digital-native leadership appointment (Chief Digital Officer, VP of Digital Transformation, or equivalent) has been evidenced. The Skills &amp; Capabilities dimension scores 60/100 (Siloed), reflecting a workforce optimized for physical manufacturing with limited public evidence of systematic digital capability building.</w:t>
       </w:r>
     </w:p>
     <w:p/>
@@ -1719,8 +1653,8 @@
       </w:tblPr>
       <w:tblGrid>
         <w:gridCol w:w="2835"/>
-        <w:gridCol w:w="1134"/>
-        <w:gridCol w:w="5669"/>
+        <w:gridCol w:w="1701"/>
+        <w:gridCol w:w="5102"/>
       </w:tblGrid>
       <w:tr>
         <w:tc>
@@ -1764,7 +1698,7 @@
                 <w:b/>
                 <w:color w:val="FFFFFF"/>
               </w:rPr>
-              <w:t>Evidence</w:t>
+              <w:t>Public Signal / Evidence</w:t>
             </w:r>
           </w:p>
         </w:tc>
@@ -1777,7 +1711,7 @@
           </w:tcPr>
           <w:p>
             <w:r>
-              <w:t>IC01: India Pneumatics Market Size</w:t>
+              <w:t>SC01: Digital Talent Hiring Signals</w:t>
             </w:r>
           </w:p>
         </w:tc>
@@ -1788,7 +1722,7 @@
           </w:tcPr>
           <w:p>
             <w:r>
-              <w:t>70/100</w:t>
+              <w:t>55/100 (Siloed)</w:t>
             </w:r>
           </w:p>
         </w:tc>
@@ -1799,7 +1733,7 @@
           </w:tcPr>
           <w:p>
             <w:r>
-              <w:t>$1.06B (2024); growing to $1.94B by 2033 — mid-size addressable market</w:t>
+              <w:t>662 employees primarily engineering/manufacturing; limited software or data role hiring signals</w:t>
             </w:r>
           </w:p>
         </w:tc>
@@ -1812,7 +1746,7 @@
           </w:tcPr>
           <w:p>
             <w:r>
-              <w:t>IC02: Industry Growth Rate</w:t>
+              <w:t>SC02: Technical Workforce Depth</w:t>
             </w:r>
           </w:p>
         </w:tc>
@@ -1823,7 +1757,7 @@
           </w:tcPr>
           <w:p>
             <w:r>
-              <w:t>78/100</w:t>
+              <w:t>72/100 (Strategic)</w:t>
             </w:r>
           </w:p>
         </w:tc>
@@ -1834,7 +1768,7 @@
           </w:tcPr>
           <w:p>
             <w:r>
-              <w:t>CAGR 6.9% (2025–2033) — healthy; aligned with industrial capex cycle</w:t>
+              <w:t>Strong mechanical engineering base; DSIR R&amp;D team; CNC and automation specialists</w:t>
             </w:r>
           </w:p>
         </w:tc>
@@ -1847,7 +1781,7 @@
           </w:tcPr>
           <w:p>
             <w:r>
-              <w:t>IC03: Competitive Position</w:t>
+              <w:t>SC03: Digital Training Programs</w:t>
             </w:r>
           </w:p>
         </w:tc>
@@ -1858,7 +1792,7 @@
           </w:tcPr>
           <w:p>
             <w:r>
-              <w:t>70/100</w:t>
+              <w:t>50/100 (Siloed)</w:t>
             </w:r>
           </w:p>
         </w:tc>
@@ -1869,7 +1803,7 @@
           </w:tcPr>
           <w:p>
             <w:r>
-              <w:t>Domestic leader in mid-market; competes with SMC, Festo, Parker in premium</w:t>
+              <w:t>No public L&amp;D investment, digital upskilling programs, or online learning adoption disclosed</w:t>
             </w:r>
           </w:p>
         </w:tc>
@@ -1878,33 +1812,33 @@
         <w:tc>
           <w:tcPr>
             <w:tcW w:type="dxa" w:w="3135"/>
-            <w:shd w:val="clear" w:color="auto" w:fill="D5E8D4"/>
+            <w:shd w:val="clear" w:color="auto" w:fill="FFF2CC"/>
           </w:tcPr>
           <w:p>
             <w:r>
-              <w:t>IC04: Macro Tailwinds</w:t>
+              <w:t>SC04: Leadership Digital Literacy</w:t>
             </w:r>
           </w:p>
         </w:tc>
         <w:tc>
           <w:tcPr>
             <w:tcW w:type="dxa" w:w="3135"/>
-            <w:shd w:val="clear" w:color="auto" w:fill="D5E8D4"/>
+            <w:shd w:val="clear" w:color="auto" w:fill="FFF2CC"/>
           </w:tcPr>
           <w:p>
             <w:r>
-              <w:t>82/100</w:t>
+              <w:t>65/100 (Siloed)</w:t>
             </w:r>
           </w:p>
         </w:tc>
         <w:tc>
           <w:tcPr>
             <w:tcW w:type="dxa" w:w="3135"/>
-            <w:shd w:val="clear" w:color="auto" w:fill="D5E8D4"/>
+            <w:shd w:val="clear" w:color="auto" w:fill="FFF2CC"/>
           </w:tcPr>
           <w:p>
             <w:r>
-              <w:t>Make in India, PLI schemes, China+1 sourcing, manufacturing automation</w:t>
+              <w:t>Management I4.0 awareness via product decisions; no digital leadership hire signals</w:t>
             </w:r>
           </w:p>
         </w:tc>
@@ -1913,33 +1847,33 @@
         <w:tc>
           <w:tcPr>
             <w:tcW w:type="dxa" w:w="3135"/>
-            <w:shd w:val="clear" w:color="auto" w:fill="D5E8D4"/>
+            <w:shd w:val="clear" w:color="auto" w:fill="FFF2CC"/>
           </w:tcPr>
           <w:p>
             <w:r>
-              <w:t>IC05: End-Market Diversification</w:t>
+              <w:t>SC05: Innovation Culture Signals</w:t>
             </w:r>
           </w:p>
         </w:tc>
         <w:tc>
           <w:tcPr>
             <w:tcW w:type="dxa" w:w="3135"/>
-            <w:shd w:val="clear" w:color="auto" w:fill="D5E8D4"/>
+            <w:shd w:val="clear" w:color="auto" w:fill="FFF2CC"/>
           </w:tcPr>
           <w:p>
             <w:r>
-              <w:t>76/100</w:t>
+              <w:t>58/100 (Siloed)</w:t>
             </w:r>
           </w:p>
         </w:tc>
         <w:tc>
           <w:tcPr>
             <w:tcW w:type="dxa" w:w="3135"/>
-            <w:shd w:val="clear" w:color="auto" w:fill="D5E8D4"/>
+            <w:shd w:val="clear" w:color="auto" w:fill="FFF2CC"/>
           </w:tcPr>
           <w:p>
             <w:r>
-              <w:t>7 end-use industries: pharma, auto, packaging, food, medical, textile, printing</w:t>
+              <w:t>DSIR R&amp;D present; no hackathon, innovation lab, startup engagement, or employee innovation program</w:t>
             </w:r>
           </w:p>
         </w:tc>
@@ -1959,12 +1893,746 @@
         <w:rPr>
           <w:color w:val="1F3864"/>
         </w:rPr>
-        <w:t>12. Section 12 — Evidence &amp; Source Citations</w:t>
+        <w:t>7. Next Best Actions — Digital Transformation Roadmap</w:t>
       </w:r>
     </w:p>
     <w:p>
       <w:r>
-        <w:t>All scores in this report are derived exclusively from publicly available information as of the report date. No management interviews, internal documents, or non-public financials were accessed.</w:t>
+        <w:t>Based on the five-dimension DDMR diagnosis, the following initiatives represent the highest-impact digital transformation actions Janatics India should undertake, sequenced by priority. Each initiative is grounded in specific sub-metric gaps, quantified benefit expectations, the cost of inaction, and the market window that makes timing critical.</w:t>
+      </w:r>
+    </w:p>
+    <w:p/>
+    <w:p>
+      <w:pPr>
+        <w:pStyle w:val="Heading2"/>
+        <w:jc w:val="left"/>
+      </w:pPr>
+      <w:r>
+        <w:rPr>
+          <w:color w:val="2E75B6"/>
+        </w:rPr>
+        <w:t>01 — HIGH PRIORITY: Activate a B2B Digital Sales Channel</w:t>
+      </w:r>
+    </w:p>
+    <w:p>
+      <w:r>
+        <w:rPr>
+          <w:b/>
+        </w:rPr>
+        <w:t xml:space="preserve">Addresses: </w:t>
+      </w:r>
+      <w:r>
+        <w:t>Sales &amp; Marketing · SM03: 45/100 (Lowest sub-metric) · SM02: 40/100</w:t>
+      </w:r>
+    </w:p>
+    <w:p/>
+    <w:tbl>
+      <w:tblPr>
+        <w:tblStyle w:val="TableGrid"/>
+        <w:tblW w:type="auto" w:w="0"/>
+        <w:tblLook w:firstColumn="1" w:firstRow="1" w:lastColumn="0" w:lastRow="0" w:noHBand="0" w:noVBand="1" w:val="04A0"/>
+      </w:tblPr>
+      <w:tblGrid>
+        <w:gridCol w:w="1984"/>
+        <w:gridCol w:w="7654"/>
+      </w:tblGrid>
+      <w:tr>
+        <w:tc>
+          <w:tcPr>
+            <w:tcW w:type="dxa" w:w="4703"/>
+            <w:shd w:val="clear" w:color="auto" w:fill="1F3864"/>
+          </w:tcPr>
+          <w:p>
+            <w:r>
+              <w:rPr>
+                <w:b/>
+                <w:color w:val="FFFFFF"/>
+                <w:sz w:val="18"/>
+              </w:rPr>
+              <w:t>Initiative</w:t>
+            </w:r>
+          </w:p>
+        </w:tc>
+        <w:tc>
+          <w:tcPr>
+            <w:tcW w:type="dxa" w:w="4703"/>
+            <w:shd w:val="clear" w:color="auto" w:fill="D6E4F0"/>
+          </w:tcPr>
+          <w:p>
+            <w:r>
+              <w:rPr>
+                <w:sz w:val="18"/>
+              </w:rPr>
+              <w:t>Launch a B2B digital ordering portal with a searchable, SEO-optimised product catalog, real-time availability indicators, and online quote-request workflows. Integrate LinkedIn demand generation and targeted content marketing (technical application notes, case studies). Enable a mobile-responsive interface for field engineers and procurement officers.</w:t>
+            </w:r>
+          </w:p>
+        </w:tc>
+      </w:tr>
+      <w:tr>
+        <w:tc>
+          <w:tcPr>
+            <w:tcW w:type="dxa" w:w="4703"/>
+            <w:shd w:val="clear" w:color="auto" w:fill="1F3864"/>
+          </w:tcPr>
+          <w:p>
+            <w:r>
+              <w:rPr>
+                <w:b/>
+                <w:color w:val="FFFFFF"/>
+                <w:sz w:val="18"/>
+              </w:rPr>
+              <w:t>Expected Benefit</w:t>
+            </w:r>
+          </w:p>
+        </w:tc>
+        <w:tc>
+          <w:tcPr>
+            <w:tcW w:type="dxa" w:w="4703"/>
+            <w:shd w:val="clear" w:color="auto" w:fill="D5E8D4"/>
+          </w:tcPr>
+          <w:p>
+            <w:r>
+              <w:rPr>
+                <w:sz w:val="18"/>
+              </w:rPr>
+              <w:t>Estimated 15–20% incremental revenue from direct digital channel within 18 months. Reduced cost-per-lead versus distributor-led acquisition. Improved customer data visibility for CRM and cross-sell opportunities. Brand visibility among the next generation of industrial procurement professionals who default to digital-first sourcing.</w:t>
+            </w:r>
+          </w:p>
+        </w:tc>
+      </w:tr>
+      <w:tr>
+        <w:tc>
+          <w:tcPr>
+            <w:tcW w:type="dxa" w:w="4703"/>
+            <w:shd w:val="clear" w:color="auto" w:fill="1F3864"/>
+          </w:tcPr>
+          <w:p>
+            <w:r>
+              <w:rPr>
+                <w:b/>
+                <w:color w:val="FFFFFF"/>
+                <w:sz w:val="18"/>
+              </w:rPr>
+              <w:t>Cost of Inaction</w:t>
+            </w:r>
+          </w:p>
+        </w:tc>
+        <w:tc>
+          <w:tcPr>
+            <w:tcW w:type="dxa" w:w="4703"/>
+            <w:shd w:val="clear" w:color="auto" w:fill="F8CECC"/>
+          </w:tcPr>
+          <w:p>
+            <w:r>
+              <w:rPr>
+                <w:sz w:val="18"/>
+              </w:rPr>
+              <w:t>SMC Corporation, Festo, and Parker Hannifin all operate mature digital ordering platforms with SEO dominance on industrial component search terms. Every quarter without a digital channel means Janatics cedes online discovery to global competitors. Industrial buying behaviour is shifting: over 70% of B2B buyers now complete most of their research online before engaging a sales representative.</w:t>
+            </w:r>
+          </w:p>
+        </w:tc>
+      </w:tr>
+      <w:tr>
+        <w:tc>
+          <w:tcPr>
+            <w:tcW w:type="dxa" w:w="4703"/>
+            <w:shd w:val="clear" w:color="auto" w:fill="1F3864"/>
+          </w:tcPr>
+          <w:p>
+            <w:r>
+              <w:rPr>
+                <w:b/>
+                <w:color w:val="FFFFFF"/>
+                <w:sz w:val="18"/>
+              </w:rPr>
+              <w:t>Why Now</w:t>
+            </w:r>
+          </w:p>
+        </w:tc>
+        <w:tc>
+          <w:tcPr>
+            <w:tcW w:type="dxa" w:w="4703"/>
+            <w:shd w:val="clear" w:color="auto" w:fill="DAE8FC"/>
+          </w:tcPr>
+          <w:p>
+            <w:r>
+              <w:rPr>
+                <w:sz w:val="18"/>
+              </w:rPr>
+              <w:t>India's B2B e-commerce in industrial components is growing 25%+ annually. Janatics has a unique window: a 49-year brand, 17,000+ customer relationships, and 3,500+ SKUs — the exact assets needed to win digital-first industrial buyers. First-mover advantage in domestic pneumatics digital commerce is still available; it will not remain so for long as global players intensify India localisation.</w:t>
+            </w:r>
+          </w:p>
+        </w:tc>
+      </w:tr>
+      <w:tr>
+        <w:trPr>
+          <w:trHeight w:val="113"/>
+        </w:trPr>
+        <w:tc>
+          <w:tcPr>
+            <w:tcW w:type="dxa" w:w="9406"/>
+            <w:gridSpan w:val="2"/>
+          </w:tcPr>
+          <w:p>
+            <w:r/>
+          </w:p>
+        </w:tc>
+      </w:tr>
+    </w:tbl>
+    <w:p/>
+    <w:p>
+      <w:pPr>
+        <w:pStyle w:val="Heading2"/>
+        <w:jc w:val="left"/>
+      </w:pPr>
+      <w:r>
+        <w:rPr>
+          <w:color w:val="2E75B6"/>
+        </w:rPr>
+        <w:t>02 — HIGH PRIORITY: Deploy ERP and Supply Chain Visibility Platform</w:t>
+      </w:r>
+    </w:p>
+    <w:p>
+      <w:r>
+        <w:rPr>
+          <w:b/>
+        </w:rPr>
+        <w:t xml:space="preserve">Addresses: </w:t>
+      </w:r>
+      <w:r>
+        <w:t>Operations &amp; Supply Chain · OSC02: 50/100 · OSC01: 60/100</w:t>
+      </w:r>
+    </w:p>
+    <w:p/>
+    <w:tbl>
+      <w:tblPr>
+        <w:tblStyle w:val="TableGrid"/>
+        <w:tblW w:type="auto" w:w="0"/>
+        <w:tblLook w:firstColumn="1" w:firstRow="1" w:lastColumn="0" w:lastRow="0" w:noHBand="0" w:noVBand="1" w:val="04A0"/>
+      </w:tblPr>
+      <w:tblGrid>
+        <w:gridCol w:w="1984"/>
+        <w:gridCol w:w="7654"/>
+      </w:tblGrid>
+      <w:tr>
+        <w:tc>
+          <w:tcPr>
+            <w:tcW w:type="dxa" w:w="4703"/>
+            <w:shd w:val="clear" w:color="auto" w:fill="1F3864"/>
+          </w:tcPr>
+          <w:p>
+            <w:r>
+              <w:rPr>
+                <w:b/>
+                <w:color w:val="FFFFFF"/>
+                <w:sz w:val="18"/>
+              </w:rPr>
+              <w:t>Initiative</w:t>
+            </w:r>
+          </w:p>
+        </w:tc>
+        <w:tc>
+          <w:tcPr>
+            <w:tcW w:type="dxa" w:w="4703"/>
+            <w:shd w:val="clear" w:color="auto" w:fill="D6E4F0"/>
+          </w:tcPr>
+          <w:p>
+            <w:r>
+              <w:rPr>
+                <w:sz w:val="18"/>
+              </w:rPr>
+              <w:t>Implement an integrated ERP (SAP Business One / Oracle NetSuite / Odoo) connecting production planning, procurement, inventory, and dispatch across all three plants (Coimbatore, Ahmedabad, Noida). Add a supply chain visibility layer for real-time order tracking accessible to key customers. Publish a digitization roadmap statement to ICRA and key OEM customers.</w:t>
+            </w:r>
+          </w:p>
+        </w:tc>
+      </w:tr>
+      <w:tr>
+        <w:tc>
+          <w:tcPr>
+            <w:tcW w:type="dxa" w:w="4703"/>
+            <w:shd w:val="clear" w:color="auto" w:fill="1F3864"/>
+          </w:tcPr>
+          <w:p>
+            <w:r>
+              <w:rPr>
+                <w:b/>
+                <w:color w:val="FFFFFF"/>
+                <w:sz w:val="18"/>
+              </w:rPr>
+              <w:t>Expected Benefit</w:t>
+            </w:r>
+          </w:p>
+        </w:tc>
+        <w:tc>
+          <w:tcPr>
+            <w:tcW w:type="dxa" w:w="4703"/>
+            <w:shd w:val="clear" w:color="auto" w:fill="D5E8D4"/>
+          </w:tcPr>
+          <w:p>
+            <w:r>
+              <w:rPr>
+                <w:sz w:val="18"/>
+              </w:rPr>
+              <w:t>10–15% reduction in production inefficiencies through better demand planning and inventory optimisation. Faster order-to-delivery cycle times. Eligibility for global OEM vendor qualification audits that require digital supply chain traceability — directly unlocking higher-value export contracts. Improved ICRA credit assessment through demonstrated operational discipline.</w:t>
+            </w:r>
+          </w:p>
+        </w:tc>
+      </w:tr>
+      <w:tr>
+        <w:tc>
+          <w:tcPr>
+            <w:tcW w:type="dxa" w:w="4703"/>
+            <w:shd w:val="clear" w:color="auto" w:fill="1F3864"/>
+          </w:tcPr>
+          <w:p>
+            <w:r>
+              <w:rPr>
+                <w:b/>
+                <w:color w:val="FFFFFF"/>
+                <w:sz w:val="18"/>
+              </w:rPr>
+              <w:t>Cost of Inaction</w:t>
+            </w:r>
+          </w:p>
+        </w:tc>
+        <w:tc>
+          <w:tcPr>
+            <w:tcW w:type="dxa" w:w="4703"/>
+            <w:shd w:val="clear" w:color="auto" w:fill="F8CECC"/>
+          </w:tcPr>
+          <w:p>
+            <w:r>
+              <w:rPr>
+                <w:sz w:val="18"/>
+              </w:rPr>
+              <w:t>Global OEM customers in automotive, pharmaceutical packaging, and food processing increasingly mandate supply chain transparency and digital traceability as a vendor qualification criterion. Without an ERP-backed system, Janatics risks disqualification from high-value export RFQs — irrespective of product quality — because the operational risk profile appears unquantifiable to procurement teams.</w:t>
+            </w:r>
+          </w:p>
+        </w:tc>
+      </w:tr>
+      <w:tr>
+        <w:tc>
+          <w:tcPr>
+            <w:tcW w:type="dxa" w:w="4703"/>
+            <w:shd w:val="clear" w:color="auto" w:fill="1F3864"/>
+          </w:tcPr>
+          <w:p>
+            <w:r>
+              <w:rPr>
+                <w:b/>
+                <w:color w:val="FFFFFF"/>
+                <w:sz w:val="18"/>
+              </w:rPr>
+              <w:t>Why Now</w:t>
+            </w:r>
+          </w:p>
+        </w:tc>
+        <w:tc>
+          <w:tcPr>
+            <w:tcW w:type="dxa" w:w="4703"/>
+            <w:shd w:val="clear" w:color="auto" w:fill="DAE8FC"/>
+          </w:tcPr>
+          <w:p>
+            <w:r>
+              <w:rPr>
+                <w:sz w:val="18"/>
+              </w:rPr>
+              <w:t>Make in India and China+1 sourcing shifts are generating an unprecedented volume of global OEM procurement inquiries toward Indian component manufacturers. Janatics has a 12–18 month window to establish digital operational credibility before qualification pipelines close. Companies that fail to digitalise operations in this window will be locked out of the next cycle of global supply chain restructuring.</w:t>
+            </w:r>
+          </w:p>
+        </w:tc>
+      </w:tr>
+      <w:tr>
+        <w:trPr>
+          <w:trHeight w:val="113"/>
+        </w:trPr>
+        <w:tc>
+          <w:tcPr>
+            <w:tcW w:type="dxa" w:w="9406"/>
+            <w:gridSpan w:val="2"/>
+          </w:tcPr>
+          <w:p>
+            <w:r/>
+          </w:p>
+        </w:tc>
+      </w:tr>
+    </w:tbl>
+    <w:p/>
+    <w:p>
+      <w:pPr>
+        <w:pStyle w:val="Heading2"/>
+        <w:jc w:val="left"/>
+      </w:pPr>
+      <w:r>
+        <w:rPr>
+          <w:color w:val="2E75B6"/>
+        </w:rPr>
+        <w:t>03 — MEDIUM PRIORITY: Build a Digital Workforce Capability Program</w:t>
+      </w:r>
+    </w:p>
+    <w:p>
+      <w:r>
+        <w:rPr>
+          <w:b/>
+        </w:rPr>
+        <w:t xml:space="preserve">Addresses: </w:t>
+      </w:r>
+      <w:r>
+        <w:t>Skills &amp; Capabilities · SC03: 50/100 · SC01: 55/100</w:t>
+      </w:r>
+    </w:p>
+    <w:p/>
+    <w:tbl>
+      <w:tblPr>
+        <w:tblStyle w:val="TableGrid"/>
+        <w:tblW w:type="auto" w:w="0"/>
+        <w:tblLook w:firstColumn="1" w:firstRow="1" w:lastColumn="0" w:lastRow="0" w:noHBand="0" w:noVBand="1" w:val="04A0"/>
+      </w:tblPr>
+      <w:tblGrid>
+        <w:gridCol w:w="1984"/>
+        <w:gridCol w:w="7654"/>
+      </w:tblGrid>
+      <w:tr>
+        <w:tc>
+          <w:tcPr>
+            <w:tcW w:type="dxa" w:w="4703"/>
+            <w:shd w:val="clear" w:color="auto" w:fill="1F3864"/>
+          </w:tcPr>
+          <w:p>
+            <w:r>
+              <w:rPr>
+                <w:b/>
+                <w:color w:val="FFFFFF"/>
+                <w:sz w:val="18"/>
+              </w:rPr>
+              <w:t>Initiative</w:t>
+            </w:r>
+          </w:p>
+        </w:tc>
+        <w:tc>
+          <w:tcPr>
+            <w:tcW w:type="dxa" w:w="4703"/>
+            <w:shd w:val="clear" w:color="auto" w:fill="D6E4F0"/>
+          </w:tcPr>
+          <w:p>
+            <w:r>
+              <w:rPr>
+                <w:sz w:val="18"/>
+              </w:rPr>
+              <w:t>Launch a 12-month structured digital upskilling program covering data literacy, digital tool proficiency (ERP, CRM, analytics dashboards), and digital communication for all engineering and management staff. Hire 2–3 dedicated digital roles: data analyst, digital marketing manager, and ERP/IT lead. Partner with an L&amp;D platform (Coursera, LinkedIn Learning, or NASSCOM Digital Skilling).</w:t>
+            </w:r>
+          </w:p>
+        </w:tc>
+      </w:tr>
+      <w:tr>
+        <w:tc>
+          <w:tcPr>
+            <w:tcW w:type="dxa" w:w="4703"/>
+            <w:shd w:val="clear" w:color="auto" w:fill="1F3864"/>
+          </w:tcPr>
+          <w:p>
+            <w:r>
+              <w:rPr>
+                <w:b/>
+                <w:color w:val="FFFFFF"/>
+                <w:sz w:val="18"/>
+              </w:rPr>
+              <w:t>Expected Benefit</w:t>
+            </w:r>
+          </w:p>
+        </w:tc>
+        <w:tc>
+          <w:tcPr>
+            <w:tcW w:type="dxa" w:w="4703"/>
+            <w:shd w:val="clear" w:color="auto" w:fill="D5E8D4"/>
+          </w:tcPr>
+          <w:p>
+            <w:r>
+              <w:rPr>
+                <w:sz w:val="18"/>
+              </w:rPr>
+              <w:t>Accelerates adoption velocity of all other digital investments — ERP, e-commerce, and analytics perform at a fraction of potential without digitally capable users. Reduces transformation failure risk (60–70% of digital transformations fail due to people, not technology). Builds internal champions who sustain change without perpetual consultant dependency. Improves talent retention among younger engineers who prioritise digital growth environments.</w:t>
+            </w:r>
+          </w:p>
+        </w:tc>
+      </w:tr>
+      <w:tr>
+        <w:tc>
+          <w:tcPr>
+            <w:tcW w:type="dxa" w:w="4703"/>
+            <w:shd w:val="clear" w:color="auto" w:fill="1F3864"/>
+          </w:tcPr>
+          <w:p>
+            <w:r>
+              <w:rPr>
+                <w:b/>
+                <w:color w:val="FFFFFF"/>
+                <w:sz w:val="18"/>
+              </w:rPr>
+              <w:t>Cost of Inaction</w:t>
+            </w:r>
+          </w:p>
+        </w:tc>
+        <w:tc>
+          <w:tcPr>
+            <w:tcW w:type="dxa" w:w="4703"/>
+            <w:shd w:val="clear" w:color="auto" w:fill="F8CECC"/>
+          </w:tcPr>
+          <w:p>
+            <w:r>
+              <w:rPr>
+                <w:sz w:val="18"/>
+              </w:rPr>
+              <w:t>Technology without people is stranded investment. Every rupee spent on ERP, e-commerce, or analytics will underperform if the workforce lacks confidence and capability to use it. The risk is not technology failure — it is adoption failure, which is both more expensive and harder to reverse.</w:t>
+            </w:r>
+          </w:p>
+        </w:tc>
+      </w:tr>
+      <w:tr>
+        <w:tc>
+          <w:tcPr>
+            <w:tcW w:type="dxa" w:w="4703"/>
+            <w:shd w:val="clear" w:color="auto" w:fill="1F3864"/>
+          </w:tcPr>
+          <w:p>
+            <w:r>
+              <w:rPr>
+                <w:b/>
+                <w:color w:val="FFFFFF"/>
+                <w:sz w:val="18"/>
+              </w:rPr>
+              <w:t>Why Now</w:t>
+            </w:r>
+          </w:p>
+        </w:tc>
+        <w:tc>
+          <w:tcPr>
+            <w:tcW w:type="dxa" w:w="4703"/>
+            <w:shd w:val="clear" w:color="auto" w:fill="DAE8FC"/>
+          </w:tcPr>
+          <w:p>
+            <w:r>
+              <w:rPr>
+                <w:sz w:val="18"/>
+              </w:rPr>
+              <w:t>India's digital skills gap in manufacturing is widening as demand outpaces supply. Early movers in workforce upskilling gain a 2–3 year head start on talent acquisition and internal capability building. The cost of a structured program today is a fraction of the consultant fees required to compensate for skills gaps during live digital deployments.</w:t>
+            </w:r>
+          </w:p>
+        </w:tc>
+      </w:tr>
+      <w:tr>
+        <w:trPr>
+          <w:trHeight w:val="113"/>
+        </w:trPr>
+        <w:tc>
+          <w:tcPr>
+            <w:tcW w:type="dxa" w:w="9406"/>
+            <w:gridSpan w:val="2"/>
+          </w:tcPr>
+          <w:p>
+            <w:r/>
+          </w:p>
+        </w:tc>
+      </w:tr>
+    </w:tbl>
+    <w:p/>
+    <w:p>
+      <w:pPr>
+        <w:pStyle w:val="Heading2"/>
+        <w:jc w:val="left"/>
+      </w:pPr>
+      <w:r>
+        <w:rPr>
+          <w:color w:val="2E75B6"/>
+        </w:rPr>
+        <w:t>04 — MEDIUM PRIORITY: Convert Coimbatore Plant into a Smart Factory Showcase</w:t>
+      </w:r>
+    </w:p>
+    <w:p>
+      <w:r>
+        <w:rPr>
+          <w:b/>
+        </w:rPr>
+        <w:t xml:space="preserve">Addresses: </w:t>
+      </w:r>
+      <w:r>
+        <w:t>Technology Adoption · TA01: 65/100 · Strategy · ST03: 75/100</w:t>
+      </w:r>
+    </w:p>
+    <w:p/>
+    <w:tbl>
+      <w:tblPr>
+        <w:tblStyle w:val="TableGrid"/>
+        <w:tblW w:type="auto" w:w="0"/>
+        <w:tblLook w:firstColumn="1" w:firstRow="1" w:lastColumn="0" w:lastRow="0" w:noHBand="0" w:noVBand="1" w:val="04A0"/>
+      </w:tblPr>
+      <w:tblGrid>
+        <w:gridCol w:w="1984"/>
+        <w:gridCol w:w="7654"/>
+      </w:tblGrid>
+      <w:tr>
+        <w:tc>
+          <w:tcPr>
+            <w:tcW w:type="dxa" w:w="4703"/>
+            <w:shd w:val="clear" w:color="auto" w:fill="1F3864"/>
+          </w:tcPr>
+          <w:p>
+            <w:r>
+              <w:rPr>
+                <w:b/>
+                <w:color w:val="FFFFFF"/>
+                <w:sz w:val="18"/>
+              </w:rPr>
+              <w:t>Initiative</w:t>
+            </w:r>
+          </w:p>
+        </w:tc>
+        <w:tc>
+          <w:tcPr>
+            <w:tcW w:type="dxa" w:w="4703"/>
+            <w:shd w:val="clear" w:color="auto" w:fill="D6E4F0"/>
+          </w:tcPr>
+          <w:p>
+            <w:r>
+              <w:rPr>
+                <w:sz w:val="18"/>
+              </w:rPr>
+              <w:t>Deploy Janatics' own Industry 4.0 sensors, electric actuators, and robotic systems on the Coimbatore production floor as a live demonstration environment. Document the deployment as a case study. Create a customer visit programme and virtual tour capability. Use the showcase in sales materials, RFQ responses, and ICRA presentations as evidence of digital operational maturity.</w:t>
+            </w:r>
+          </w:p>
+        </w:tc>
+      </w:tr>
+      <w:tr>
+        <w:tc>
+          <w:tcPr>
+            <w:tcW w:type="dxa" w:w="4703"/>
+            <w:shd w:val="clear" w:color="auto" w:fill="1F3864"/>
+          </w:tcPr>
+          <w:p>
+            <w:r>
+              <w:rPr>
+                <w:b/>
+                <w:color w:val="FFFFFF"/>
+                <w:sz w:val="18"/>
+              </w:rPr>
+              <w:t>Expected Benefit</w:t>
+            </w:r>
+          </w:p>
+        </w:tc>
+        <w:tc>
+          <w:tcPr>
+            <w:tcW w:type="dxa" w:w="4703"/>
+            <w:shd w:val="clear" w:color="auto" w:fill="D5E8D4"/>
+          </w:tcPr>
+          <w:p>
+            <w:r>
+              <w:rPr>
+                <w:sz w:val="18"/>
+              </w:rPr>
+              <w:t>Validates product performance with proof-by-example — the most credible sales tool available. Accelerates B2B sales cycles for I4.0 product lines by allowing customers to see before they buy. Generates authentic case study content for digital marketing. Signals vendor digital maturity to global OEM evaluators conducting site audits. Qualifies Janatics for smart manufacturing certification programmes.</w:t>
+            </w:r>
+          </w:p>
+        </w:tc>
+      </w:tr>
+      <w:tr>
+        <w:tc>
+          <w:tcPr>
+            <w:tcW w:type="dxa" w:w="4703"/>
+            <w:shd w:val="clear" w:color="auto" w:fill="1F3864"/>
+          </w:tcPr>
+          <w:p>
+            <w:r>
+              <w:rPr>
+                <w:b/>
+                <w:color w:val="FFFFFF"/>
+                <w:sz w:val="18"/>
+              </w:rPr>
+              <w:t>Cost of Inaction</w:t>
+            </w:r>
+          </w:p>
+        </w:tc>
+        <w:tc>
+          <w:tcPr>
+            <w:tcW w:type="dxa" w:w="4703"/>
+            <w:shd w:val="clear" w:color="auto" w:fill="F8CECC"/>
+          </w:tcPr>
+          <w:p>
+            <w:r>
+              <w:rPr>
+                <w:sz w:val="18"/>
+              </w:rPr>
+              <w:t>Selling Industry 4.0 products while operating a non-digitized factory is a credibility contradiction that sophisticated buyers detect during site visits and RFQ evaluations. The gap between Janatics' product claims and its own operational reality is the single most visible inconsistency in its current market positioning.</w:t>
+            </w:r>
+          </w:p>
+        </w:tc>
+      </w:tr>
+      <w:tr>
+        <w:tc>
+          <w:tcPr>
+            <w:tcW w:type="dxa" w:w="4703"/>
+            <w:shd w:val="clear" w:color="auto" w:fill="1F3864"/>
+          </w:tcPr>
+          <w:p>
+            <w:r>
+              <w:rPr>
+                <w:b/>
+                <w:color w:val="FFFFFF"/>
+                <w:sz w:val="18"/>
+              </w:rPr>
+              <w:t>Why Now</w:t>
+            </w:r>
+          </w:p>
+        </w:tc>
+        <w:tc>
+          <w:tcPr>
+            <w:tcW w:type="dxa" w:w="4703"/>
+            <w:shd w:val="clear" w:color="auto" w:fill="DAE8FC"/>
+          </w:tcPr>
+          <w:p>
+            <w:r>
+              <w:rPr>
+                <w:sz w:val="18"/>
+              </w:rPr>
+              <w:t>Janatics already owns the technology — internal deployment requires no new vendor relationship, no new capital outlay beyond installation, and no unproven technology risk. This is the fastest credibility-building action available. The smart factory narrative also aligns with PLI scheme reporting requirements and MSME digital certification programmes that offer financial incentives.</w:t>
+            </w:r>
+          </w:p>
+        </w:tc>
+      </w:tr>
+      <w:tr>
+        <w:trPr>
+          <w:trHeight w:val="113"/>
+        </w:trPr>
+        <w:tc>
+          <w:tcPr>
+            <w:tcW w:type="dxa" w:w="9406"/>
+            <w:gridSpan w:val="2"/>
+          </w:tcPr>
+          <w:p>
+            <w:r/>
+          </w:p>
+        </w:tc>
+      </w:tr>
+    </w:tbl>
+    <w:p>
+      <w:r>
+        <w:br w:type="page"/>
+      </w:r>
+    </w:p>
+    <w:p>
+      <w:pPr>
+        <w:pStyle w:val="Heading1"/>
+        <w:jc w:val="left"/>
+      </w:pPr>
+      <w:r>
+        <w:rPr>
+          <w:color w:val="1F3864"/>
+        </w:rPr>
+        <w:t>12. Evidence &amp; Source Citations</w:t>
+      </w:r>
+    </w:p>
+    <w:p>
+      <w:r>
+        <w:t>All scores in this report are derived exclusively from publicly available information as of the report date. No management interviews, internal documents, or non-public data were accessed. Digital maturity signals are assessed against observable public evidence — websites, job postings, product announcements, regulatory filings, and third-party databases.</w:t>
       </w:r>
     </w:p>
     <w:p>
@@ -1992,7 +2660,7 @@
         <w:t xml:space="preserve">ICRA Credit Rating: </w:t>
       </w:r>
       <w:r>
-        <w:t>Multiple ICRA rating reaffirmations (2021, 2022, 2023, 2025). Stable outlook. Healthy debt protection metrics confirmed. FY2025 revenue ₹527.8 Cr confirmed. Source: icra.in rationale reports (IDs 105171, 120842, 130532, 139580).</w:t>
+        <w:t>Multiple ICRA rating reaffirmations (2021–2025). Stable outlook. Healthy debt protection metrics. FY2025 revenue ₹527.8 Cr confirmed. Source: icra.in rationale reports.</w:t>
       </w:r>
     </w:p>
     <w:p>
@@ -2006,7 +2674,7 @@
         <w:t xml:space="preserve">Tracxn / Tofler: </w:t>
       </w:r>
       <w:r>
-        <w:t>FY2025 revenue ₹531 Cr; 662 employees; EBITDA CAGR -22% (1-yr). Authorized capital ₹30 Cr; paid-up ₹26.5 Cr. Source: tracxn.com, tofler.in company profiles.</w:t>
+        <w:t>FY2025 revenue ₹531 Cr; 662 employees. Authorized capital ₹30 Cr; paid-up ₹26.5 Cr. Source: tracxn.com, tofler.in company profiles.</w:t>
       </w:r>
     </w:p>
     <w:p>
@@ -2020,21 +2688,7 @@
         <w:t xml:space="preserve">Company Websites: </w:t>
       </w:r>
       <w:r>
-        <w:t>Product portfolio (3,500+ SKUs), manufacturing facilities (Coimbatore 70,000 sqm, Ahmedabad, Noida), export presence (42+ countries), subsidiaries (USA, Germany), customer base (17,000+), distribution network (200 partners), DSIR R&amp;D recognition. Source: janatics.com, janaticspneumatics.com.</w:t>
-      </w:r>
-    </w:p>
-    <w:p>
-      <w:pPr>
-        <w:pStyle w:val="ListBullet"/>
-      </w:pPr>
-      <w:r>
-        <w:rPr>
-          <w:b/>
-        </w:rPr>
-        <w:t xml:space="preserve">Industry Research: </w:t>
-      </w:r>
-      <w:r>
-        <w:t>India pneumatic equipment market: $1.06B (2024), CAGR 6.9% (2025–2033). Source: IMARC Group market reports, Fortune Business Insights, Grand View Research.</w:t>
+        <w:t>Product portfolio (3,500+ SKUs), manufacturing facilities (Coimbatore 70,000 sqm, Ahmedabad, Noida), export presence (42+ countries), subsidiaries (USA, Germany), customer base (17,000+), distribution network (200 partners), DSIR R&amp;D recognition, Industry 4.0 / electric actuator / robotic product lines. Source: janatics.com, janaticspneumatics.com.</w:t>
       </w:r>
     </w:p>
     <w:p>
@@ -2049,6 +2703,20 @@
       </w:r>
       <w:r>
         <w:t>Janatics India Pvt Ltd listed as member of Automation Industry Association India. Source: aia-india.org/member-directory.</w:t>
+      </w:r>
+    </w:p>
+    <w:p>
+      <w:pPr>
+        <w:pStyle w:val="ListBullet"/>
+      </w:pPr>
+      <w:r>
+        <w:rPr>
+          <w:b/>
+        </w:rPr>
+        <w:t xml:space="preserve">Digital Signals (Absence): </w:t>
+      </w:r>
+      <w:r>
+        <w:t>No B2B e-commerce portal, LinkedIn active engagement, cloud migration announcement, ERP/MES disclosure, digital upskilling program, cybersecurity framework, or formal DX roadmap identified from public sources as of report date.</w:t>
       </w:r>
     </w:p>
     <w:p/>
@@ -2066,7 +2734,7 @@
     </w:p>
     <w:p>
       <w:r>
-        <w:t>This report is prepared for informational and due diligence purposes only. Scores are based on publicly available data and analytical judgment. They do not constitute investment advice, credit assessment, or a representation of the company's current financial position. Full financial statements (P&amp;L, balance sheet, cash flow) should be obtained directly from the company for a complete financial assessment.</w:t>
+        <w:t>This Digital Diagnostic and Maturity Report (DDMR) is prepared for informational purposes only. Scores and maturity labels are based on publicly available data and analytical judgment. They do not constitute investment advice, credit assessment, or a definitive representation of the company's digital capabilities. Internal systems, processes, and initiatives not publicly disclosed are not captured in this assessment.</w:t>
       </w:r>
     </w:p>
     <w:sectPr>

</xml_diff>